<commit_message>
v1.13.30: Training guides: preservation part 1 updated, part 4 portable export
</commit_message>
<xml_diff>
--- a/docs/training-preservation-1-ingest-wizard.docx
+++ b/docs/training-preservation-1-ingest-wizard.docx
@@ -2295,7 +2295,7 @@
       </w:tr>
     </w:tbl>
     <w:bookmarkEnd w:id="47"/>
-    <w:bookmarkStart w:id="54" w:name="the-new-records"/>
+    <w:bookmarkStart w:id="57" w:name="the-new-records"/>
     <w:p>
       <w:pPr>
         <w:pStyle w:val="Heading2"/>
@@ -2382,7 +2382,7 @@
         <w:pStyle w:val="BodyText"/>
       </w:pPr>
       <w:r>
-        <w:t xml:space="preserve">Each diary carries its description, dates and creator from the CSV, and its scan in the IIIF viewer.</w:t>
+        <w:t xml:space="preserve">Each diary carries its description and its scan in the IIIF viewer.</w:t>
       </w:r>
     </w:p>
     <w:p>
@@ -2440,8 +2440,128 @@
         <w:t xml:space="preserve">A diary with its digital object.</w:t>
       </w:r>
     </w:p>
-    <w:bookmarkEnd w:id="54"/>
-    <w:bookmarkStart w:id="55" w:name="rolling-back"/>
+    <w:p>
+      <w:pPr>
+        <w:pStyle w:val="BodyText"/>
+      </w:pPr>
+      <w:r>
+        <w:t xml:space="preserve">The CSV’s event columns (</w:t>
+      </w:r>
+      <w:r>
+        <w:rPr>
+          <w:rStyle w:val="VerbatimChar"/>
+        </w:rPr>
+        <w:t xml:space="preserve">eventTypes</w:t>
+      </w:r>
+      <w:r>
+        <w:t xml:space="preserve">,</w:t>
+      </w:r>
+      <w:r>
+        <w:t xml:space="preserve"> </w:t>
+      </w:r>
+      <w:r>
+        <w:rPr>
+          <w:rStyle w:val="VerbatimChar"/>
+        </w:rPr>
+        <w:t xml:space="preserve">eventActors</w:t>
+      </w:r>
+      <w:r>
+        <w:t xml:space="preserve">,</w:t>
+      </w:r>
+      <w:r>
+        <w:t xml:space="preserve"> </w:t>
+      </w:r>
+      <w:r>
+        <w:rPr>
+          <w:rStyle w:val="VerbatimChar"/>
+        </w:rPr>
+        <w:t xml:space="preserve">eventDates</w:t>
+      </w:r>
+      <w:r>
+        <w:t xml:space="preserve">,</w:t>
+      </w:r>
+      <w:r>
+        <w:t xml:space="preserve"> </w:t>
+      </w:r>
+      <w:r>
+        <w:rPr>
+          <w:rStyle w:val="VerbatimChar"/>
+        </w:rPr>
+        <w:t xml:space="preserve">eventStartDates</w:t>
+      </w:r>
+      <w:r>
+        <w:t xml:space="preserve">,</w:t>
+      </w:r>
+      <w:r>
+        <w:t xml:space="preserve"> </w:t>
+      </w:r>
+      <w:r>
+        <w:rPr>
+          <w:rStyle w:val="VerbatimChar"/>
+        </w:rPr>
+        <w:t xml:space="preserve">eventEndDates</w:t>
+      </w:r>
+      <w:r>
+        <w:t xml:space="preserve">, pipe-separated and aligned by position) become the record’s dates and creator. A creator not yet in the archive becomes a new authority record, shared by every row that names it; a missing event type is Creation.</w:t>
+      </w:r>
+    </w:p>
+    <w:p>
+      <w:pPr>
+        <w:pStyle w:val="CaptionedFigure"/>
+      </w:pPr>
+      <w:r>
+        <w:drawing>
+          <wp:inline>
+            <wp:extent cx="5778500" cy="3250406"/>
+            <wp:effectExtent b="0" l="0" r="0" t="0"/>
+            <wp:docPr descr="The date and creator from the CSV." title="" id="55" name="Picture"/>
+            <a:graphic>
+              <a:graphicData uri="http://schemas.openxmlformats.org/drawingml/2006/picture">
+                <pic:pic>
+                  <pic:nvPicPr>
+                    <pic:cNvPr descr="images/training-preservation-1/10-item-dates.png" id="56" name="Picture"/>
+                    <pic:cNvPicPr>
+                      <a:picLocks noChangeArrowheads="1" noChangeAspect="1"/>
+                    </pic:cNvPicPr>
+                  </pic:nvPicPr>
+                  <pic:blipFill>
+                    <a:blip r:embed="rId54"/>
+                    <a:stretch>
+                      <a:fillRect/>
+                    </a:stretch>
+                  </pic:blipFill>
+                  <pic:spPr bwMode="auto">
+                    <a:xfrm>
+                      <a:off x="0" y="0"/>
+                      <a:ext cx="5778500" cy="3250406"/>
+                    </a:xfrm>
+                    <a:prstGeom prst="rect">
+                      <a:avLst/>
+                    </a:prstGeom>
+                    <a:noFill/>
+                    <a:ln w="9525">
+                      <a:noFill/>
+                      <a:headEnd/>
+                      <a:tailEnd/>
+                    </a:ln>
+                  </pic:spPr>
+                </pic:pic>
+              </a:graphicData>
+            </a:graphic>
+          </wp:inline>
+        </w:drawing>
+      </w:r>
+    </w:p>
+    <w:p>
+      <w:pPr>
+        <w:pStyle w:val="ImageCaption"/>
+      </w:pPr>
+      <w:r>
+        <w:t xml:space="preserve">The date and creator from the CSV.</w:t>
+      </w:r>
+    </w:p>
+    <w:bookmarkEnd w:id="57"/>
+    <w:bookmarkStart w:id="58" w:name="rolling-back"/>
     <w:p>
       <w:pPr>
         <w:pStyle w:val="Heading2"/>
@@ -2474,8 +2594,8 @@
         <w:t xml:space="preserve">on the commit report (or on the dashboard) deletes everything the ingest created: the digital objects, the records and a parent record it created, provided nothing else has since been filed under that parent. Keep the practice diaries for part 2.</w:t>
       </w:r>
     </w:p>
-    <w:bookmarkEnd w:id="55"/>
-    <w:bookmarkStart w:id="56" w:name="recap"/>
+    <w:bookmarkEnd w:id="58"/>
+    <w:bookmarkStart w:id="59" w:name="recap"/>
     <w:p>
       <w:pPr>
         <w:pStyle w:val="Heading2"/>
@@ -2540,7 +2660,7 @@
         <w:t xml:space="preserve">Part 2 covers fixity checks, format identification, virus scanning and PREMIS events.</w:t>
       </w:r>
     </w:p>
-    <w:bookmarkEnd w:id="56"/>
+    <w:bookmarkEnd w:id="59"/>
     <w:sectPr>
       <w:headerReference r:id="rId9" w:type="default"/>
       <w:footerReference r:id="rId10" w:type="default"/>

</xml_diff>

<commit_message>
v1.13.48: Ingest training guide: packages are written to the ingest work folder
</commit_message>
<xml_diff>
--- a/docs/training-preservation-1-ingest-wizard.docx
+++ b/docs/training-preservation-1-ingest-wizard.docx
@@ -197,19 +197,7 @@
         <w:pStyle w:val="Author"/>
       </w:pPr>
       <w:r>
-        <w:t xml:space="preserve">Dr</w:t>
-      </w:r>
-      <w:r>
-        <w:t xml:space="preserve"> </w:t>
-      </w:r>
-      <w:r>
-        <w:t xml:space="preserve">Johan</w:t>
-      </w:r>
-      <w:r>
-        <w:t xml:space="preserve"> </w:t>
-      </w:r>
-      <w:r>
-        <w:t xml:space="preserve">Pieterse</w:t>
+        <w:t xml:space="preserve">The Archive and Heritage Group (Pty) Ltd</w:t>
       </w:r>
     </w:p>
     <w:p>
@@ -496,56 +484,6 @@
         </w:tc>
       </w:tr>
     </w:tbl>
-    <w:p>
-      <w:pPr>
-        <w:pStyle w:val="TOCHeading"/>
-      </w:pPr>
-      <w:r>
-        <w:t xml:space="preserve">Contents</w:t>
-      </w:r>
-    </w:p>
-    <w:p>
-      <w:r>
-        <w:fldChar w:fldCharType="begin" w:dirty="true"/>
-      </w:r>
-      <w:r>
-        <w:instrText xml:space="preserve"> TOC \o "1-3" \h \z \u </w:instrText>
-      </w:r>
-      <w:r>
-        <w:fldChar w:fldCharType="separate"/>
-      </w:r>
-      <w:r>
-        <w:t>Right-click and choose Update Field to build this list.</w:t>
-      </w:r>
-      <w:r>
-        <w:fldChar w:fldCharType="end"/>
-      </w:r>
-    </w:p>
-    <w:p>
-      <w:pPr>
-        <w:pStyle w:val="TOCHeading"/>
-      </w:pPr>
-      <w:r>
-        <w:t xml:space="preserve">List of Tables</w:t>
-      </w:r>
-    </w:p>
-    <w:p>
-      <w:r>
-        <w:fldChar w:fldCharType="begin" w:dirty="true"/>
-      </w:r>
-      <w:r>
-        <w:instrText xml:space="preserve"> TOC \h \z \t "Table Caption,1" </w:instrText>
-      </w:r>
-      <w:r>
-        <w:fldChar w:fldCharType="separate"/>
-      </w:r>
-      <w:r>
-        <w:t>Right-click and choose Update Field to build this list.</w:t>
-      </w:r>
-      <w:r>
-        <w:fldChar w:fldCharType="end"/>
-      </w:r>
-    </w:p>
     <w:p>
       <w:pPr>
         <w:pStyle w:val="BodyText"/>
@@ -2146,7 +2084,13 @@
               <w:rPr>
                 <w:rStyle w:val="VerbatimChar"/>
               </w:rPr>
-              <w:t xml:space="preserve">uploads/sip/</w:t>
+              <w:t xml:space="preserve">sip/</w:t>
+            </w:r>
+            <w:r>
+              <w:t xml:space="preserve"> </w:t>
+            </w:r>
+            <w:r>
+              <w:t xml:space="preserve">in the ingest work folder</w:t>
             </w:r>
           </w:p>
         </w:tc>
@@ -2187,7 +2131,13 @@
               <w:rPr>
                 <w:rStyle w:val="VerbatimChar"/>
               </w:rPr>
-              <w:t xml:space="preserve">uploads/aip/</w:t>
+              <w:t xml:space="preserve">aip/</w:t>
+            </w:r>
+            <w:r>
+              <w:t xml:space="preserve"> </w:t>
+            </w:r>
+            <w:r>
+              <w:t xml:space="preserve">in the ingest work folder</w:t>
             </w:r>
           </w:p>
         </w:tc>
@@ -2276,7 +2226,13 @@
               <w:rPr>
                 <w:rStyle w:val="VerbatimChar"/>
               </w:rPr>
-              <w:t xml:space="preserve">uploads/dip/</w:t>
+              <w:t xml:space="preserve">dip/</w:t>
+            </w:r>
+            <w:r>
+              <w:t xml:space="preserve"> </w:t>
+            </w:r>
+            <w:r>
+              <w:t xml:space="preserve">in the ingest work folder</w:t>
             </w:r>
           </w:p>
         </w:tc>
@@ -2294,6 +2250,41 @@
         </w:tc>
       </w:tr>
     </w:tbl>
+    <w:p>
+      <w:pPr>
+        <w:pStyle w:val="BodyText"/>
+      </w:pPr>
+      <w:r>
+        <w:t xml:space="preserve">The ingest work folder is</w:t>
+      </w:r>
+      <w:r>
+        <w:t xml:space="preserve"> </w:t>
+      </w:r>
+      <w:r>
+        <w:rPr>
+          <w:rStyle w:val="VerbatimChar"/>
+        </w:rPr>
+        <w:t xml:space="preserve">/var/lib/ahg-ingest/&lt;instance&gt;</w:t>
+      </w:r>
+      <w:r>
+        <w:t xml:space="preserve"> </w:t>
+      </w:r>
+      <w:r>
+        <w:t xml:space="preserve">unless an administrator sets</w:t>
+      </w:r>
+      <w:r>
+        <w:t xml:space="preserve"> </w:t>
+      </w:r>
+      <w:r>
+        <w:rPr>
+          <w:rStyle w:val="VerbatimChar"/>
+        </w:rPr>
+        <w:t xml:space="preserve">ingest_work_dir</w:t>
+      </w:r>
+      <w:r>
+        <w:t xml:space="preserve">. It sits outside the web root, so packages, uploaded files and job logs cannot be downloaded from the site. A session with its own output paths, set on the Configure step, writes there instead.</w:t>
+      </w:r>
+    </w:p>
     <w:bookmarkEnd w:id="47"/>
     <w:bookmarkStart w:id="57" w:name="the-new-records"/>
     <w:p>

</xml_diff>